<commit_message>
Edits to CCD Optimization Module
Edits made by Tani Greengart and Hesam Sharghi
- Filenames now update automatically from config.json, not from OTCD_DTU10MW.yaml
- Appropriately named output file is created
- Cp-Ct-Cq file fixed
- CMakeText files added for ease of installation
- Installation documentation updated to include BModes
</commit_message>
<xml_diff>
--- a/documentation/OTCD_installation_instructions.docx
+++ b/documentation/OTCD_installation_instructions.docx
@@ -4097,6 +4097,21 @@
     <w:p>
       <w:pPr>
         <w:pStyle w:val="NormalParagraph"/>
+        <w:ind w:firstLine="0"/>
+        <w:rPr>
+          <w:u w:val="single"/>
+        </w:rPr>
+      </w:pPr>
+      <w:r>
+        <w:rPr>
+          <w:u w:val="single"/>
+        </w:rPr>
+        <w:t>NOTE: TACS installation documentation is incomplete.</w:t>
+      </w:r>
+    </w:p>
+    <w:p>
+      <w:pPr>
+        <w:pStyle w:val="NormalParagraph"/>
         <w:numPr>
           <w:ilvl w:val="0"/>
           <w:numId w:val="13"/>
@@ -4874,6 +4889,7 @@
         <w:jc w:val="left"/>
       </w:pPr>
       <w:r>
+        <w:lastRenderedPageBreak/>
         <w:t xml:space="preserve">Within the </w:t>
       </w:r>
       <w:proofErr w:type="spellStart"/>
@@ -4909,7 +4925,6 @@
         <w:jc w:val="left"/>
       </w:pPr>
       <w:r>
-        <w:lastRenderedPageBreak/>
         <w:t xml:space="preserve">Open </w:t>
       </w:r>
       <w:r>
@@ -5817,7 +5832,6 @@
       </w:pPr>
       <w:proofErr w:type="spellStart"/>
       <w:r>
-        <w:lastRenderedPageBreak/>
         <w:t>PyGeo</w:t>
       </w:r>
       <w:proofErr w:type="spellEnd"/>
@@ -6348,6 +6362,347 @@
         <w:ind w:firstLine="0"/>
       </w:pPr>
     </w:p>
+    <w:p>
+      <w:pPr>
+        <w:pStyle w:val="Heading2"/>
+      </w:pPr>
+      <w:proofErr w:type="spellStart"/>
+      <w:r>
+        <w:t>BModes</w:t>
+      </w:r>
+      <w:proofErr w:type="spellEnd"/>
+    </w:p>
+    <w:p>
+      <w:pPr>
+        <w:pStyle w:val="NormalParagraph"/>
+        <w:numPr>
+          <w:ilvl w:val="0"/>
+          <w:numId w:val="30"/>
+        </w:numPr>
+        <w:jc w:val="left"/>
+      </w:pPr>
+      <w:r>
+        <w:t xml:space="preserve">Clone the </w:t>
+      </w:r>
+      <w:proofErr w:type="spellStart"/>
+      <w:r>
+        <w:t>BModes</w:t>
+      </w:r>
+      <w:proofErr w:type="spellEnd"/>
+      <w:r>
+        <w:t xml:space="preserve"> repository from: </w:t>
+      </w:r>
+      <w:hyperlink r:id="rId35" w:history="1">
+        <w:r>
+          <w:rPr>
+            <w:rStyle w:val="Hyperlink"/>
+          </w:rPr>
+          <w:t>https://github.com/old-NWTC/BModes</w:t>
+        </w:r>
+      </w:hyperlink>
+    </w:p>
+    <w:p>
+      <w:pPr>
+        <w:pStyle w:val="NormalParagraph"/>
+        <w:numPr>
+          <w:ilvl w:val="0"/>
+          <w:numId w:val="30"/>
+        </w:numPr>
+        <w:jc w:val="left"/>
+      </w:pPr>
+      <w:r>
+        <w:t xml:space="preserve">Update </w:t>
+      </w:r>
+      <w:proofErr w:type="spellStart"/>
+      <w:r>
+        <w:t>CMakeLists</w:t>
+      </w:r>
+      <w:proofErr w:type="spellEnd"/>
+      <w:r>
+        <w:t xml:space="preserve"> files so </w:t>
+      </w:r>
+      <w:proofErr w:type="spellStart"/>
+      <w:r>
+        <w:t>BModes</w:t>
+      </w:r>
+      <w:proofErr w:type="spellEnd"/>
+      <w:r>
+        <w:t xml:space="preserve"> can compile properly on Linux:</w:t>
+      </w:r>
+    </w:p>
+    <w:p>
+      <w:pPr>
+        <w:pStyle w:val="NormalParagraph"/>
+        <w:numPr>
+          <w:ilvl w:val="1"/>
+          <w:numId w:val="30"/>
+        </w:numPr>
+        <w:jc w:val="left"/>
+      </w:pPr>
+      <w:r>
+        <w:t xml:space="preserve">Navigate to the </w:t>
+      </w:r>
+      <w:proofErr w:type="spellStart"/>
+      <w:r>
+        <w:t>OpenTurbineCoDe</w:t>
+      </w:r>
+      <w:proofErr w:type="spellEnd"/>
+      <w:r>
+        <w:t xml:space="preserve"> &gt; </w:t>
+      </w:r>
+      <w:proofErr w:type="spellStart"/>
+      <w:r>
+        <w:t>openturbinecode</w:t>
+      </w:r>
+      <w:proofErr w:type="spellEnd"/>
+      <w:r>
+        <w:t xml:space="preserve"> &gt; </w:t>
+      </w:r>
+      <w:r>
+        <w:t>controls</w:t>
+      </w:r>
+      <w:r>
+        <w:t xml:space="preserve"> &gt; </w:t>
+      </w:r>
+      <w:proofErr w:type="spellStart"/>
+      <w:r>
+        <w:t>BModes_src</w:t>
+      </w:r>
+      <w:proofErr w:type="spellEnd"/>
+      <w:r>
+        <w:t xml:space="preserve"> folder</w:t>
+      </w:r>
+      <w:r>
+        <w:t xml:space="preserve">, copy the “CMakeLists.txt” file from there, and paste it into the </w:t>
+      </w:r>
+      <w:proofErr w:type="spellStart"/>
+      <w:r>
+        <w:t>BModes</w:t>
+      </w:r>
+      <w:proofErr w:type="spellEnd"/>
+      <w:r>
+        <w:t xml:space="preserve"> &gt; </w:t>
+      </w:r>
+      <w:proofErr w:type="spellStart"/>
+      <w:r>
+        <w:t>src</w:t>
+      </w:r>
+      <w:proofErr w:type="spellEnd"/>
+      <w:r>
+        <w:t xml:space="preserve"> folder, replacing the </w:t>
+      </w:r>
+      <w:r>
+        <w:t>“CMakeLists.txt” file</w:t>
+      </w:r>
+      <w:r>
+        <w:t xml:space="preserve"> that is already there.</w:t>
+      </w:r>
+    </w:p>
+    <w:p>
+      <w:pPr>
+        <w:pStyle w:val="NormalParagraph"/>
+        <w:numPr>
+          <w:ilvl w:val="1"/>
+          <w:numId w:val="30"/>
+        </w:numPr>
+        <w:jc w:val="left"/>
+      </w:pPr>
+      <w:r>
+        <w:t>Also, n</w:t>
+      </w:r>
+      <w:r>
+        <w:t xml:space="preserve">avigate to the </w:t>
+      </w:r>
+      <w:proofErr w:type="spellStart"/>
+      <w:r>
+        <w:t>OpenTurbineCoDe</w:t>
+      </w:r>
+      <w:proofErr w:type="spellEnd"/>
+      <w:r>
+        <w:t xml:space="preserve"> &gt; </w:t>
+      </w:r>
+      <w:proofErr w:type="spellStart"/>
+      <w:r>
+        <w:t>openturbinecode</w:t>
+      </w:r>
+      <w:proofErr w:type="spellEnd"/>
+      <w:r>
+        <w:t xml:space="preserve"> &gt; controls &gt; </w:t>
+      </w:r>
+      <w:proofErr w:type="spellStart"/>
+      <w:r>
+        <w:t>BModes_src</w:t>
+      </w:r>
+      <w:proofErr w:type="spellEnd"/>
+      <w:r>
+        <w:t xml:space="preserve"> </w:t>
+      </w:r>
+      <w:r>
+        <w:t xml:space="preserve">&gt; NWTC_Library_v1 </w:t>
+      </w:r>
+      <w:r>
+        <w:t xml:space="preserve">folder, copy the “CMakeLists.txt” file from there, and paste it into the </w:t>
+      </w:r>
+      <w:proofErr w:type="spellStart"/>
+      <w:r>
+        <w:t>BModes</w:t>
+      </w:r>
+      <w:proofErr w:type="spellEnd"/>
+      <w:r>
+        <w:t xml:space="preserve"> &gt; </w:t>
+      </w:r>
+      <w:proofErr w:type="spellStart"/>
+      <w:r>
+        <w:t>src</w:t>
+      </w:r>
+      <w:proofErr w:type="spellEnd"/>
+      <w:r>
+        <w:t xml:space="preserve"> </w:t>
+      </w:r>
+      <w:r>
+        <w:t xml:space="preserve">&gt; </w:t>
+      </w:r>
+      <w:r>
+        <w:t>NWTC_Library_v1 folder, replacing the “CMakeLists.txt” file that is already there.</w:t>
+      </w:r>
+    </w:p>
+    <w:p>
+      <w:pPr>
+        <w:pStyle w:val="NormalParagraph"/>
+        <w:numPr>
+          <w:ilvl w:val="0"/>
+          <w:numId w:val="30"/>
+        </w:numPr>
+        <w:jc w:val="left"/>
+      </w:pPr>
+      <w:r>
+        <w:t xml:space="preserve">Create a build folder within </w:t>
+      </w:r>
+      <w:proofErr w:type="spellStart"/>
+      <w:r>
+        <w:t>BModes</w:t>
+      </w:r>
+      <w:proofErr w:type="spellEnd"/>
+      <w:r>
+        <w:t xml:space="preserve"> &gt; </w:t>
+      </w:r>
+      <w:proofErr w:type="spellStart"/>
+      <w:r>
+        <w:t>src</w:t>
+      </w:r>
+      <w:proofErr w:type="spellEnd"/>
+      <w:r>
+        <w:t>. Then navigate in</w:t>
+      </w:r>
+      <w:r>
+        <w:t xml:space="preserve">side the build folder and type </w:t>
+      </w:r>
+      <w:proofErr w:type="spellStart"/>
+      <w:r>
+        <w:rPr>
+          <w:highlight w:val="lightGray"/>
+        </w:rPr>
+        <w:t>cmake</w:t>
+      </w:r>
+      <w:proofErr w:type="spellEnd"/>
+      <w:r>
+        <w:rPr>
+          <w:highlight w:val="lightGray"/>
+        </w:rPr>
+        <w:t xml:space="preserve"> ..</w:t>
+      </w:r>
+      <w:r>
+        <w:t xml:space="preserve">. Then type </w:t>
+      </w:r>
+      <w:r>
+        <w:rPr>
+          <w:highlight w:val="lightGray"/>
+        </w:rPr>
+        <w:t>make</w:t>
+      </w:r>
+      <w:r>
+        <w:t xml:space="preserve"> to compile </w:t>
+      </w:r>
+      <w:proofErr w:type="spellStart"/>
+      <w:r>
+        <w:t>BModes</w:t>
+      </w:r>
+      <w:proofErr w:type="spellEnd"/>
+      <w:r>
+        <w:t xml:space="preserve">. The executable files should be located in </w:t>
+      </w:r>
+      <w:proofErr w:type="spellStart"/>
+      <w:r>
+        <w:t>BModes</w:t>
+      </w:r>
+      <w:proofErr w:type="spellEnd"/>
+      <w:r>
+        <w:t xml:space="preserve"> &gt; </w:t>
+      </w:r>
+      <w:proofErr w:type="spellStart"/>
+      <w:r>
+        <w:t>src</w:t>
+      </w:r>
+      <w:proofErr w:type="spellEnd"/>
+      <w:r>
+        <w:t xml:space="preserve"> &gt; build &gt; </w:t>
+      </w:r>
+      <w:proofErr w:type="spellStart"/>
+      <w:proofErr w:type="gramStart"/>
+      <w:r>
+        <w:t>bmodes</w:t>
+      </w:r>
+      <w:proofErr w:type="spellEnd"/>
+      <w:proofErr w:type="gramEnd"/>
+    </w:p>
+    <w:p>
+      <w:pPr>
+        <w:pStyle w:val="NormalParagraph"/>
+        <w:numPr>
+          <w:ilvl w:val="0"/>
+          <w:numId w:val="30"/>
+        </w:numPr>
+        <w:jc w:val="left"/>
+      </w:pPr>
+      <w:r>
+        <w:t xml:space="preserve">Add the </w:t>
+      </w:r>
+      <w:r>
+        <w:t xml:space="preserve">full </w:t>
+      </w:r>
+      <w:r>
+        <w:t xml:space="preserve">path of the </w:t>
+      </w:r>
+      <w:proofErr w:type="spellStart"/>
+      <w:r>
+        <w:t>bmodes</w:t>
+      </w:r>
+      <w:proofErr w:type="spellEnd"/>
+      <w:r>
+        <w:t xml:space="preserve"> executable to </w:t>
+      </w:r>
+      <w:proofErr w:type="spellStart"/>
+      <w:proofErr w:type="gramStart"/>
+      <w:r>
+        <w:t>config.json</w:t>
+      </w:r>
+      <w:proofErr w:type="spellEnd"/>
+      <w:proofErr w:type="gramEnd"/>
+      <w:r>
+        <w:t xml:space="preserve"> next to “</w:t>
+      </w:r>
+      <w:proofErr w:type="spellStart"/>
+      <w:r>
+        <w:t>path_to_</w:t>
+      </w:r>
+      <w:r>
+        <w:t>bmodes</w:t>
+      </w:r>
+      <w:proofErr w:type="spellEnd"/>
+      <w:r>
+        <w:t>.”</w:t>
+      </w:r>
+    </w:p>
     <w:p/>
     <w:p>
       <w:r>
@@ -6394,7 +6749,7 @@
       <w:r>
         <w:t xml:space="preserve">Install Python at </w:t>
       </w:r>
-      <w:hyperlink r:id="rId35" w:history="1">
+      <w:hyperlink r:id="rId36" w:history="1">
         <w:r>
           <w:rPr>
             <w:rStyle w:val="Hyperlink"/>
@@ -6415,7 +6770,7 @@
       <w:r>
         <w:t xml:space="preserve">Install Git at </w:t>
       </w:r>
-      <w:hyperlink r:id="rId36" w:history="1">
+      <w:hyperlink r:id="rId37" w:history="1">
         <w:r>
           <w:rPr>
             <w:rStyle w:val="Hyperlink"/>
@@ -6780,7 +7135,7 @@
       <w:r>
         <w:t xml:space="preserve">Go to </w:t>
       </w:r>
-      <w:hyperlink r:id="rId37" w:history="1">
+      <w:hyperlink r:id="rId38" w:history="1">
         <w:r>
           <w:rPr>
             <w:rStyle w:val="Hyperlink"/>
@@ -7100,7 +7455,7 @@
       <w:r>
         <w:t xml:space="preserve">Go to </w:t>
       </w:r>
-      <w:hyperlink r:id="rId38" w:history="1">
+      <w:hyperlink r:id="rId39" w:history="1">
         <w:r>
           <w:rPr>
             <w:rStyle w:val="Hyperlink"/>
@@ -7372,7 +7727,7 @@
       <w:r>
         <w:t xml:space="preserve">, which must be manually compiled from the source code. The steps for installing both of these modules are nearly identical. Documentation for doing this is located here: </w:t>
       </w:r>
-      <w:hyperlink r:id="rId39" w:anchor="compile-from-source" w:history="1">
+      <w:hyperlink r:id="rId40" w:anchor="compile-from-source" w:history="1">
         <w:r>
           <w:rPr>
             <w:color w:val="0000FF"/>
@@ -7429,7 +7784,7 @@
       <w:r>
         <w:t xml:space="preserve">First, ensure that you have Microsoft Visual Studio installed </w:t>
       </w:r>
-      <w:hyperlink r:id="rId40" w:history="1">
+      <w:hyperlink r:id="rId41" w:history="1">
         <w:r>
           <w:rPr>
             <w:color w:val="0000FF"/>
@@ -7441,7 +7796,7 @@
       <w:r>
         <w:t xml:space="preserve">. As of July 2022, the Intel Fortran Compiler (see next step) is not compatible with the latest version of Visual Studio, so you may need to install the 2019 version of Visual Studio instead. This can be found here: </w:t>
       </w:r>
-      <w:hyperlink r:id="rId41" w:history="1">
+      <w:hyperlink r:id="rId42" w:history="1">
         <w:r>
           <w:rPr>
             <w:color w:val="0000FF"/>
@@ -7463,7 +7818,7 @@
       <w:r>
         <w:t xml:space="preserve">Once Visual Studio is installed, download the Intel Fortran Compiler from </w:t>
       </w:r>
-      <w:hyperlink r:id="rId42" w:anchor="fortran" w:history="1">
+      <w:hyperlink r:id="rId43" w:anchor="fortran" w:history="1">
         <w:r>
           <w:rPr>
             <w:rStyle w:val="Hyperlink"/>
@@ -7503,7 +7858,7 @@
       <w:r>
         <w:t xml:space="preserve"> Driver 2.4 source code. Go to </w:t>
       </w:r>
-      <w:hyperlink r:id="rId43" w:history="1">
+      <w:hyperlink r:id="rId44" w:history="1">
         <w:r>
           <w:rPr>
             <w:rStyle w:val="Hyperlink"/>
@@ -7774,7 +8129,7 @@
       <w:r>
         <w:t xml:space="preserve">, and source code can be found here: </w:t>
       </w:r>
-      <w:hyperlink r:id="rId44" w:history="1">
+      <w:hyperlink r:id="rId45" w:history="1">
         <w:r>
           <w:rPr>
             <w:rStyle w:val="Hyperlink"/>
@@ -7881,7 +8236,7 @@
       <w:r>
         <w:t xml:space="preserve"> installed from </w:t>
       </w:r>
-      <w:hyperlink r:id="rId45" w:history="1">
+      <w:hyperlink r:id="rId46" w:history="1">
         <w:r>
           <w:rPr>
             <w:rStyle w:val="Hyperlink"/>
@@ -7929,7 +8284,7 @@
       <w:r>
         <w:t xml:space="preserve"> 7.3.0 binaries from </w:t>
       </w:r>
-      <w:hyperlink r:id="rId46" w:history="1">
+      <w:hyperlink r:id="rId47" w:history="1">
         <w:r>
           <w:rPr>
             <w:rStyle w:val="Hyperlink"/>
@@ -8439,7 +8794,7 @@
       <w:r>
         <w:t xml:space="preserve">To download Salome, go to </w:t>
       </w:r>
-      <w:hyperlink r:id="rId47" w:history="1">
+      <w:hyperlink r:id="rId48" w:history="1">
         <w:r>
           <w:rPr>
             <w:rStyle w:val="Hyperlink"/>
@@ -8563,7 +8918,7 @@
       </w:r>
     </w:p>
     <w:sectPr>
-      <w:footerReference w:type="default" r:id="rId48"/>
+      <w:footerReference w:type="default" r:id="rId49"/>
       <w:pgSz w:w="12240" w:h="15840"/>
       <w:pgMar w:top="1440" w:right="1440" w:bottom="1440" w:left="1440" w:header="720" w:footer="720" w:gutter="0"/>
       <w:cols w:space="720"/>
@@ -10381,6 +10736,95 @@
     </w:lvl>
   </w:abstractNum>
   <w:abstractNum w:abstractNumId="17" w15:restartNumberingAfterBreak="0">
+    <w:nsid w:val="4AEA2703"/>
+    <w:multiLevelType w:val="hybridMultilevel"/>
+    <w:tmpl w:val="48CC4C70"/>
+    <w:lvl w:ilvl="0" w:tplc="04090011">
+      <w:start w:val="1"/>
+      <w:numFmt w:val="decimal"/>
+      <w:lvlText w:val="%1)"/>
+      <w:lvlJc w:val="left"/>
+      <w:pPr>
+        <w:ind w:left="720" w:hanging="360"/>
+      </w:pPr>
+      <w:rPr>
+        <w:rFonts w:hint="default"/>
+      </w:rPr>
+    </w:lvl>
+    <w:lvl w:ilvl="1" w:tplc="04090019">
+      <w:start w:val="1"/>
+      <w:numFmt w:val="lowerLetter"/>
+      <w:lvlText w:val="%2."/>
+      <w:lvlJc w:val="left"/>
+      <w:pPr>
+        <w:ind w:left="1440" w:hanging="360"/>
+      </w:pPr>
+    </w:lvl>
+    <w:lvl w:ilvl="2" w:tplc="0409001B" w:tentative="1">
+      <w:start w:val="1"/>
+      <w:numFmt w:val="lowerRoman"/>
+      <w:lvlText w:val="%3."/>
+      <w:lvlJc w:val="right"/>
+      <w:pPr>
+        <w:ind w:left="2160" w:hanging="180"/>
+      </w:pPr>
+    </w:lvl>
+    <w:lvl w:ilvl="3" w:tplc="0409000F" w:tentative="1">
+      <w:start w:val="1"/>
+      <w:numFmt w:val="decimal"/>
+      <w:lvlText w:val="%4."/>
+      <w:lvlJc w:val="left"/>
+      <w:pPr>
+        <w:ind w:left="2880" w:hanging="360"/>
+      </w:pPr>
+    </w:lvl>
+    <w:lvl w:ilvl="4" w:tplc="04090019" w:tentative="1">
+      <w:start w:val="1"/>
+      <w:numFmt w:val="lowerLetter"/>
+      <w:lvlText w:val="%5."/>
+      <w:lvlJc w:val="left"/>
+      <w:pPr>
+        <w:ind w:left="3600" w:hanging="360"/>
+      </w:pPr>
+    </w:lvl>
+    <w:lvl w:ilvl="5" w:tplc="0409001B" w:tentative="1">
+      <w:start w:val="1"/>
+      <w:numFmt w:val="lowerRoman"/>
+      <w:lvlText w:val="%6."/>
+      <w:lvlJc w:val="right"/>
+      <w:pPr>
+        <w:ind w:left="4320" w:hanging="180"/>
+      </w:pPr>
+    </w:lvl>
+    <w:lvl w:ilvl="6" w:tplc="0409000F" w:tentative="1">
+      <w:start w:val="1"/>
+      <w:numFmt w:val="decimal"/>
+      <w:lvlText w:val="%7."/>
+      <w:lvlJc w:val="left"/>
+      <w:pPr>
+        <w:ind w:left="5040" w:hanging="360"/>
+      </w:pPr>
+    </w:lvl>
+    <w:lvl w:ilvl="7" w:tplc="04090019" w:tentative="1">
+      <w:start w:val="1"/>
+      <w:numFmt w:val="lowerLetter"/>
+      <w:lvlText w:val="%8."/>
+      <w:lvlJc w:val="left"/>
+      <w:pPr>
+        <w:ind w:left="5760" w:hanging="360"/>
+      </w:pPr>
+    </w:lvl>
+    <w:lvl w:ilvl="8" w:tplc="0409001B" w:tentative="1">
+      <w:start w:val="1"/>
+      <w:numFmt w:val="lowerRoman"/>
+      <w:lvlText w:val="%9."/>
+      <w:lvlJc w:val="right"/>
+      <w:pPr>
+        <w:ind w:left="6480" w:hanging="180"/>
+      </w:pPr>
+    </w:lvl>
+  </w:abstractNum>
+  <w:abstractNum w:abstractNumId="18" w15:restartNumberingAfterBreak="0">
     <w:nsid w:val="4CA2305C"/>
     <w:multiLevelType w:val="hybridMultilevel"/>
     <w:tmpl w:val="D6CE6000"/>
@@ -10469,7 +10913,7 @@
       </w:pPr>
     </w:lvl>
   </w:abstractNum>
-  <w:abstractNum w:abstractNumId="18" w15:restartNumberingAfterBreak="0">
+  <w:abstractNum w:abstractNumId="19" w15:restartNumberingAfterBreak="0">
     <w:nsid w:val="4E803F62"/>
     <w:multiLevelType w:val="hybridMultilevel"/>
     <w:tmpl w:val="9CCE2056"/>
@@ -10558,7 +11002,7 @@
       </w:pPr>
     </w:lvl>
   </w:abstractNum>
-  <w:abstractNum w:abstractNumId="19" w15:restartNumberingAfterBreak="0">
+  <w:abstractNum w:abstractNumId="20" w15:restartNumberingAfterBreak="0">
     <w:nsid w:val="4FEF5AA7"/>
     <w:multiLevelType w:val="hybridMultilevel"/>
     <w:tmpl w:val="70FCFE56"/>
@@ -10647,7 +11091,7 @@
       </w:pPr>
     </w:lvl>
   </w:abstractNum>
-  <w:abstractNum w:abstractNumId="20" w15:restartNumberingAfterBreak="0">
+  <w:abstractNum w:abstractNumId="21" w15:restartNumberingAfterBreak="0">
     <w:nsid w:val="5B9C2AB7"/>
     <w:multiLevelType w:val="hybridMultilevel"/>
     <w:tmpl w:val="778831B4"/>
@@ -10736,7 +11180,7 @@
       </w:pPr>
     </w:lvl>
   </w:abstractNum>
-  <w:abstractNum w:abstractNumId="21" w15:restartNumberingAfterBreak="0">
+  <w:abstractNum w:abstractNumId="22" w15:restartNumberingAfterBreak="0">
     <w:nsid w:val="698B4D54"/>
     <w:multiLevelType w:val="hybridMultilevel"/>
     <w:tmpl w:val="4BBAA4D8"/>
@@ -10825,7 +11269,7 @@
       </w:pPr>
     </w:lvl>
   </w:abstractNum>
-  <w:abstractNum w:abstractNumId="22" w15:restartNumberingAfterBreak="0">
+  <w:abstractNum w:abstractNumId="23" w15:restartNumberingAfterBreak="0">
     <w:nsid w:val="699427AF"/>
     <w:multiLevelType w:val="hybridMultilevel"/>
     <w:tmpl w:val="293A0264"/>
@@ -10939,7 +11383,7 @@
       </w:rPr>
     </w:lvl>
   </w:abstractNum>
-  <w:abstractNum w:abstractNumId="23" w15:restartNumberingAfterBreak="0">
+  <w:abstractNum w:abstractNumId="24" w15:restartNumberingAfterBreak="0">
     <w:nsid w:val="72224F37"/>
     <w:multiLevelType w:val="hybridMultilevel"/>
     <w:tmpl w:val="D74052B2"/>
@@ -11029,7 +11473,7 @@
       </w:pPr>
     </w:lvl>
   </w:abstractNum>
-  <w:abstractNum w:abstractNumId="24" w15:restartNumberingAfterBreak="0">
+  <w:abstractNum w:abstractNumId="25" w15:restartNumberingAfterBreak="0">
     <w:nsid w:val="76A728C8"/>
     <w:multiLevelType w:val="hybridMultilevel"/>
     <w:tmpl w:val="A3AA3C0A"/>
@@ -11118,7 +11562,7 @@
       </w:pPr>
     </w:lvl>
   </w:abstractNum>
-  <w:abstractNum w:abstractNumId="25" w15:restartNumberingAfterBreak="0">
+  <w:abstractNum w:abstractNumId="26" w15:restartNumberingAfterBreak="0">
     <w:nsid w:val="775E2802"/>
     <w:multiLevelType w:val="hybridMultilevel"/>
     <w:tmpl w:val="4FCE2C04"/>
@@ -11207,7 +11651,7 @@
       </w:pPr>
     </w:lvl>
   </w:abstractNum>
-  <w:abstractNum w:abstractNumId="26" w15:restartNumberingAfterBreak="0">
+  <w:abstractNum w:abstractNumId="27" w15:restartNumberingAfterBreak="0">
     <w:nsid w:val="7B467F38"/>
     <w:multiLevelType w:val="hybridMultilevel"/>
     <w:tmpl w:val="7DD82F00"/>
@@ -11296,7 +11740,7 @@
       </w:pPr>
     </w:lvl>
   </w:abstractNum>
-  <w:abstractNum w:abstractNumId="27" w15:restartNumberingAfterBreak="0">
+  <w:abstractNum w:abstractNumId="28" w15:restartNumberingAfterBreak="0">
     <w:nsid w:val="7E387DD4"/>
     <w:multiLevelType w:val="hybridMultilevel"/>
     <w:tmpl w:val="089A44C0"/>
@@ -11382,7 +11826,7 @@
       </w:pPr>
     </w:lvl>
   </w:abstractNum>
-  <w:abstractNum w:abstractNumId="28" w15:restartNumberingAfterBreak="0">
+  <w:abstractNum w:abstractNumId="29" w15:restartNumberingAfterBreak="0">
     <w:nsid w:val="7FB87BB1"/>
     <w:multiLevelType w:val="hybridMultilevel"/>
     <w:tmpl w:val="785AA1AC"/>
@@ -11472,16 +11916,16 @@
     </w:lvl>
   </w:abstractNum>
   <w:num w:numId="1" w16cid:durableId="363137826">
-    <w:abstractNumId w:val="27"/>
+    <w:abstractNumId w:val="28"/>
   </w:num>
   <w:num w:numId="2" w16cid:durableId="2050257933">
     <w:abstractNumId w:val="15"/>
   </w:num>
   <w:num w:numId="3" w16cid:durableId="1476138906">
-    <w:abstractNumId w:val="22"/>
+    <w:abstractNumId w:val="23"/>
   </w:num>
   <w:num w:numId="4" w16cid:durableId="1003052228">
-    <w:abstractNumId w:val="23"/>
+    <w:abstractNumId w:val="24"/>
   </w:num>
   <w:num w:numId="5" w16cid:durableId="806171217">
     <w:abstractNumId w:val="13"/>
@@ -11490,16 +11934,16 @@
     <w:abstractNumId w:val="12"/>
   </w:num>
   <w:num w:numId="7" w16cid:durableId="2049914769">
-    <w:abstractNumId w:val="17"/>
+    <w:abstractNumId w:val="18"/>
   </w:num>
   <w:num w:numId="8" w16cid:durableId="1400326432">
-    <w:abstractNumId w:val="19"/>
+    <w:abstractNumId w:val="20"/>
   </w:num>
   <w:num w:numId="9" w16cid:durableId="1772701021">
     <w:abstractNumId w:val="3"/>
   </w:num>
   <w:num w:numId="10" w16cid:durableId="698700699">
-    <w:abstractNumId w:val="21"/>
+    <w:abstractNumId w:val="22"/>
   </w:num>
   <w:num w:numId="11" w16cid:durableId="577711432">
     <w:abstractNumId w:val="1"/>
@@ -11514,22 +11958,22 @@
     <w:abstractNumId w:val="5"/>
   </w:num>
   <w:num w:numId="15" w16cid:durableId="327829626">
-    <w:abstractNumId w:val="18"/>
+    <w:abstractNumId w:val="19"/>
   </w:num>
   <w:num w:numId="16" w16cid:durableId="1950237640">
+    <w:abstractNumId w:val="27"/>
+  </w:num>
+  <w:num w:numId="17" w16cid:durableId="1708287860">
     <w:abstractNumId w:val="26"/>
   </w:num>
-  <w:num w:numId="17" w16cid:durableId="1708287860">
+  <w:num w:numId="18" w16cid:durableId="1913464160">
     <w:abstractNumId w:val="25"/>
-  </w:num>
-  <w:num w:numId="18" w16cid:durableId="1913464160">
-    <w:abstractNumId w:val="24"/>
   </w:num>
   <w:num w:numId="19" w16cid:durableId="1247181759">
     <w:abstractNumId w:val="7"/>
   </w:num>
   <w:num w:numId="20" w16cid:durableId="101801846">
-    <w:abstractNumId w:val="28"/>
+    <w:abstractNumId w:val="29"/>
   </w:num>
   <w:num w:numId="21" w16cid:durableId="591426539">
     <w:abstractNumId w:val="0"/>
@@ -11547,7 +11991,7 @@
     <w:abstractNumId w:val="8"/>
   </w:num>
   <w:num w:numId="26" w16cid:durableId="209271271">
-    <w:abstractNumId w:val="20"/>
+    <w:abstractNumId w:val="21"/>
   </w:num>
   <w:num w:numId="27" w16cid:durableId="212928290">
     <w:abstractNumId w:val="10"/>
@@ -11557,6 +12001,9 @@
   </w:num>
   <w:num w:numId="29" w16cid:durableId="412165707">
     <w:abstractNumId w:val="9"/>
+  </w:num>
+  <w:num w:numId="30" w16cid:durableId="700395633">
+    <w:abstractNumId w:val="17"/>
   </w:num>
   <w:numIdMacAtCleanup w:val="7"/>
 </w:numbering>
@@ -13064,6 +13511,28 @@
 </file>
 
 <file path=customXml/item1.xml><?xml version="1.0" encoding="utf-8"?>
+<?mso-contentType ?>
+<FormTemplates xmlns="http://schemas.microsoft.com/sharepoint/v3/contenttype/forms">
+  <Display>DocumentLibraryForm</Display>
+  <Edit>DocumentLibraryForm</Edit>
+  <New>DocumentLibraryForm</New>
+</FormTemplates>
+</file>
+
+<file path=customXml/item2.xml><?xml version="1.0" encoding="utf-8"?>
+<b:Sources xmlns:b="http://schemas.openxmlformats.org/officeDocument/2006/bibliography" xmlns="http://schemas.openxmlformats.org/officeDocument/2006/bibliography" SelectedStyle="\APASixthEditionOfficeOnline.xsl" StyleName="APA" Version="6"/>
+</file>
+
+<file path=customXml/item3.xml><?xml version="1.0" encoding="utf-8"?>
+<p:properties xmlns:p="http://schemas.microsoft.com/office/2006/metadata/properties" xmlns:xsi="http://www.w3.org/2001/XMLSchema-instance" xmlns:pc="http://schemas.microsoft.com/office/infopath/2007/PartnerControls">
+  <documentManagement>
+    <_ip_UnifiedCompliancePolicyUIAction xmlns="http://schemas.microsoft.com/sharepoint/v3" xsi:nil="true"/>
+    <_ip_UnifiedCompliancePolicyProperties xmlns="http://schemas.microsoft.com/sharepoint/v3" xsi:nil="true"/>
+  </documentManagement>
+</p:properties>
+</file>
+
+<file path=customXml/item4.xml><?xml version="1.0" encoding="utf-8"?>
 <ct:contentTypeSchema xmlns:ct="http://schemas.microsoft.com/office/2006/metadata/contentType" xmlns:ma="http://schemas.microsoft.com/office/2006/metadata/properties/metaAttributes" ct:_="" ma:_="" ma:contentTypeName="Document" ma:contentTypeID="0x010100DECF7E0AE21DAD4CA0561D1576E2B144" ma:contentTypeVersion="15" ma:contentTypeDescription="Create a new document." ma:contentTypeScope="" ma:versionID="81a92b9d998916f73d47ae75e1084cc3">
   <xsd:schema xmlns:xsd="http://www.w3.org/2001/XMLSchema" xmlns:xs="http://www.w3.org/2001/XMLSchema" xmlns:p="http://schemas.microsoft.com/office/2006/metadata/properties" xmlns:ns1="http://schemas.microsoft.com/sharepoint/v3" xmlns:ns3="5dc21bfa-7eb6-4a9d-97f0-e7efaa2a113b" xmlns:ns4="774214c6-3b6d-425f-80da-59a4e3d63887" targetNamespace="http://schemas.microsoft.com/office/2006/metadata/properties" ma:root="true" ma:fieldsID="e34b5a17e8cd0592612f8fbb6e52723f" ns1:_="" ns3:_="" ns4:_="">
     <xsd:import namespace="http://schemas.microsoft.com/sharepoint/v3"/>
@@ -13303,29 +13772,33 @@
 </ct:contentTypeSchema>
 </file>
 
-<file path=customXml/item2.xml><?xml version="1.0" encoding="utf-8"?>
-<?mso-contentType ?>
-<FormTemplates xmlns="http://schemas.microsoft.com/sharepoint/v3/contenttype/forms">
-  <Display>DocumentLibraryForm</Display>
-  <Edit>DocumentLibraryForm</Edit>
-  <New>DocumentLibraryForm</New>
-</FormTemplates>
+<file path=customXml/itemProps1.xml><?xml version="1.0" encoding="utf-8"?>
+<ds:datastoreItem xmlns:ds="http://schemas.openxmlformats.org/officeDocument/2006/customXml" ds:itemID="{B2893C68-C60A-4A50-816C-D7770AD05596}">
+  <ds:schemaRefs>
+    <ds:schemaRef ds:uri="http://schemas.microsoft.com/sharepoint/v3/contenttype/forms"/>
+  </ds:schemaRefs>
+</ds:datastoreItem>
 </file>
 
-<file path=customXml/item3.xml><?xml version="1.0" encoding="utf-8"?>
-<p:properties xmlns:p="http://schemas.microsoft.com/office/2006/metadata/properties" xmlns:xsi="http://www.w3.org/2001/XMLSchema-instance" xmlns:pc="http://schemas.microsoft.com/office/infopath/2007/PartnerControls">
-  <documentManagement>
-    <_ip_UnifiedCompliancePolicyUIAction xmlns="http://schemas.microsoft.com/sharepoint/v3" xsi:nil="true"/>
-    <_ip_UnifiedCompliancePolicyProperties xmlns="http://schemas.microsoft.com/sharepoint/v3" xsi:nil="true"/>
-  </documentManagement>
-</p:properties>
+<file path=customXml/itemProps2.xml><?xml version="1.0" encoding="utf-8"?>
+<ds:datastoreItem xmlns:ds="http://schemas.openxmlformats.org/officeDocument/2006/customXml" ds:itemID="{E0D1AEA3-2613-49AB-87CC-D39AC9F9D160}">
+  <ds:schemaRefs>
+    <ds:schemaRef ds:uri="http://schemas.openxmlformats.org/officeDocument/2006/bibliography"/>
+  </ds:schemaRefs>
+</ds:datastoreItem>
 </file>
 
-<file path=customXml/item4.xml><?xml version="1.0" encoding="utf-8"?>
-<b:Sources xmlns:b="http://schemas.openxmlformats.org/officeDocument/2006/bibliography" xmlns="http://schemas.openxmlformats.org/officeDocument/2006/bibliography" SelectedStyle="\APASixthEditionOfficeOnline.xsl" StyleName="APA" Version="6"/>
+<file path=customXml/itemProps3.xml><?xml version="1.0" encoding="utf-8"?>
+<ds:datastoreItem xmlns:ds="http://schemas.openxmlformats.org/officeDocument/2006/customXml" ds:itemID="{8F5CF5B5-35A0-4484-B12E-A7EDCB87E283}">
+  <ds:schemaRefs>
+    <ds:schemaRef ds:uri="http://schemas.microsoft.com/office/2006/metadata/properties"/>
+    <ds:schemaRef ds:uri="http://schemas.microsoft.com/office/infopath/2007/PartnerControls"/>
+    <ds:schemaRef ds:uri="http://schemas.microsoft.com/sharepoint/v3"/>
+  </ds:schemaRefs>
+</ds:datastoreItem>
 </file>
 
-<file path=customXml/itemProps1.xml><?xml version="1.0" encoding="utf-8"?>
+<file path=customXml/itemProps4.xml><?xml version="1.0" encoding="utf-8"?>
 <ds:datastoreItem xmlns:ds="http://schemas.openxmlformats.org/officeDocument/2006/customXml" ds:itemID="{97423A2E-8AAA-4A86-8D50-90BA39F70088}">
   <ds:schemaRefs>
     <ds:schemaRef ds:uri="http://schemas.microsoft.com/office/2006/metadata/contentType"/>
@@ -13343,30 +13816,4 @@
     <ds:schemaRef ds:uri="http://schemas.microsoft.com/internal/obd"/>
   </ds:schemaRefs>
 </ds:datastoreItem>
-</file>
-
-<file path=customXml/itemProps2.xml><?xml version="1.0" encoding="utf-8"?>
-<ds:datastoreItem xmlns:ds="http://schemas.openxmlformats.org/officeDocument/2006/customXml" ds:itemID="{B2893C68-C60A-4A50-816C-D7770AD05596}">
-  <ds:schemaRefs>
-    <ds:schemaRef ds:uri="http://schemas.microsoft.com/sharepoint/v3/contenttype/forms"/>
-  </ds:schemaRefs>
-</ds:datastoreItem>
-</file>
-
-<file path=customXml/itemProps3.xml><?xml version="1.0" encoding="utf-8"?>
-<ds:datastoreItem xmlns:ds="http://schemas.openxmlformats.org/officeDocument/2006/customXml" ds:itemID="{8F5CF5B5-35A0-4484-B12E-A7EDCB87E283}">
-  <ds:schemaRefs>
-    <ds:schemaRef ds:uri="http://schemas.microsoft.com/office/2006/metadata/properties"/>
-    <ds:schemaRef ds:uri="http://schemas.microsoft.com/office/infopath/2007/PartnerControls"/>
-    <ds:schemaRef ds:uri="http://schemas.microsoft.com/sharepoint/v3"/>
-  </ds:schemaRefs>
-</ds:datastoreItem>
-</file>
-
-<file path=customXml/itemProps4.xml><?xml version="1.0" encoding="utf-8"?>
-<ds:datastoreItem xmlns:ds="http://schemas.openxmlformats.org/officeDocument/2006/customXml" ds:itemID="{E0D1AEA3-2613-49AB-87CC-D39AC9F9D160}">
-  <ds:schemaRefs>
-    <ds:schemaRef ds:uri="http://schemas.openxmlformats.org/officeDocument/2006/bibliography"/>
-  </ds:schemaRefs>
-</ds:datastoreItem>
 </file>
</xml_diff>